<commit_message>
Review final evidence independently and align Ass6 reference spacing
</commit_message>
<xml_diff>
--- a/ass6_output/Residential_Intelligence_Computer_Project_Proposal_REVIEWED_2026-10-18.docx
+++ b/ass6_output/Residential_Intelligence_Computer_Project_Proposal_REVIEWED_2026-10-18.docx
@@ -8520,9 +8520,12 @@
       </w:pPr>
       <w:r>
         <w:rPr>
-          <w:rFonts w:ascii="TH Sarabun New" w:hAnsi="TH Sarabun New" w:eastAsia="TH Sarabun New" w:cs="TH Sarabun New"/>
+          <w:rFonts w:ascii="TH Sarabun New" w:hAnsi="TH Sarabun New"/>
+          <w:b w:val="0"/>
+          <w:i w:val="0"/>
+          <w:sz w:val="28"/>
         </w:rPr>
-        <w:t>[1] Husom, E. J., et al. (2025). Sustainable LLM inference for edge AI: Evaluating quantized LLMs for energy efficiency, output accuracy, and inference latency. ACM Transactions on Internet of Things, 6(4), Article 28. https://doi.org/10.1145/3767742</w:t>
+        <w:t>[1] Husom,  E.  J.,  et al.  (2025).  Sustainable LLM inference for edge AI:  Evaluating quantized LLMs for energy efficiency,  output accuracy,  and inference latency.  ACM Transactions on Internet of Things,  6(4),  Article 28.  https://doi.org/10.1145/3767742</w:t>
       </w:r>
     </w:p>
     <w:p>
@@ -8533,9 +8536,12 @@
       </w:pPr>
       <w:r>
         <w:rPr>
-          <w:rFonts w:ascii="TH Sarabun New" w:hAnsi="TH Sarabun New" w:eastAsia="TH Sarabun New" w:cs="TH Sarabun New"/>
+          <w:rFonts w:ascii="TH Sarabun New" w:hAnsi="TH Sarabun New"/>
+          <w:b w:val="0"/>
+          <w:i w:val="0"/>
+          <w:sz w:val="28"/>
         </w:rPr>
-        <w:t>[2] Giedra, H., et al. (2026). Benchmarking large language model inference on limited-resource edge systems. Electronics, 15(11), 2451. doi:10.3390/electronics15112451.</w:t>
+        <w:t>[2] Giedra,  H.,  et al.  (2026).  Benchmarking large language model inference on limited-resource edge systems.  Electronics,  15(11),  2451.  doi:10.3390/electronics15112451.</w:t>
       </w:r>
     </w:p>
     <w:p>
@@ -8546,9 +8552,12 @@
       </w:pPr>
       <w:r>
         <w:rPr>
-          <w:rFonts w:ascii="TH Sarabun New" w:hAnsi="TH Sarabun New" w:eastAsia="TH Sarabun New" w:cs="TH Sarabun New"/>
+          <w:rFonts w:ascii="TH Sarabun New" w:hAnsi="TH Sarabun New"/>
+          <w:b w:val="0"/>
+          <w:i w:val="0"/>
+          <w:sz w:val="28"/>
         </w:rPr>
-        <w:t>[3] Zheng, L., et al. (2024). SGLang: Efficient execution of structured language model programs. Advances in Neural Information Processing Systems, 37, 62557-62583. https://doi.org/10.52202/079017-2000</w:t>
+        <w:t>[3] Zheng,  L.,  et al.  (2024).  SGLang:  Efficient execution of structured language model programs.  Advances in Neural Information Processing Systems,  37,  62557-62583.  https://doi.org/10.52202/079017-2000</w:t>
       </w:r>
     </w:p>
     <w:p>
@@ -8559,9 +8568,12 @@
       </w:pPr>
       <w:r>
         <w:rPr>
-          <w:rFonts w:ascii="TH Sarabun New" w:hAnsi="TH Sarabun New" w:eastAsia="TH Sarabun New" w:cs="TH Sarabun New"/>
+          <w:rFonts w:ascii="TH Sarabun New" w:hAnsi="TH Sarabun New"/>
+          <w:b w:val="0"/>
+          <w:i w:val="0"/>
+          <w:sz w:val="28"/>
         </w:rPr>
-        <w:t>[4] ณัชพล เพ็งพล และ ธนบดี เริ่มรักสกุล. (2569). ผลนำร่อง e-Eye บน PC ณ วันที่ 17 ตุลาคม 2569. บันทึกผลภายในโครงงาน. https://github.com/natchapolp-glitch/Capstone-Project/blob/main/ass5_ready_evidence.md</w:t>
+        <w:t>[4] ณัชพล เพ็งพล และ ธนบดี เริ่มรักสกุล.  (2569).  ผลนำร่อง e-Eye บน PC ณ วันที่ 17 ตุลาคม 2569.  บันทึกผลภายในโครงงาน.  https://github.com/natchapolp-glitch/Capstone-Project/blob/main/ass5_ready_evidence.md</w:t>
       </w:r>
     </w:p>
     <w:p>
@@ -8572,9 +8584,12 @@
       </w:pPr>
       <w:r>
         <w:rPr>
-          <w:rFonts w:ascii="TH Sarabun New" w:hAnsi="TH Sarabun New" w:eastAsia="TH Sarabun New" w:cs="TH Sarabun New"/>
+          <w:rFonts w:ascii="TH Sarabun New" w:hAnsi="TH Sarabun New"/>
+          <w:b w:val="0"/>
+          <w:i w:val="0"/>
+          <w:sz w:val="28"/>
         </w:rPr>
-        <w:t>[5] ggml-org. (2026). GBNF guide, llama.cpp. https://github.com/ggml-org/llama.cpp/tree/master/grammars</w:t>
+        <w:t>[5] ggml-org.  (2026).  GBNF guide,  llama.cpp.  https://github.com/ggml-org/llama.cpp/tree/master/grammars</w:t>
       </w:r>
     </w:p>
     <w:p>
@@ -8585,9 +8600,12 @@
       </w:pPr>
       <w:r>
         <w:rPr>
-          <w:rFonts w:ascii="TH Sarabun New" w:hAnsi="TH Sarabun New" w:eastAsia="TH Sarabun New" w:cs="TH Sarabun New"/>
+          <w:rFonts w:ascii="TH Sarabun New" w:hAnsi="TH Sarabun New"/>
+          <w:b w:val="0"/>
+          <w:i w:val="0"/>
+          <w:sz w:val="28"/>
         </w:rPr>
-        <w:t>[6] Ultralytics. (2026). YOLO performance metrics. https://docs.ultralytics.com/guides/yolo-performance-metrics/</w:t>
+        <w:t>[6] Ultralytics.  (2026).  YOLO performance metrics.  https://docs.ultralytics.com/guides/yolo-performance-metrics/</w:t>
       </w:r>
     </w:p>
     <w:p>
@@ -8598,9 +8616,12 @@
       </w:pPr>
       <w:r>
         <w:rPr>
-          <w:rFonts w:ascii="TH Sarabun New" w:hAnsi="TH Sarabun New" w:eastAsia="TH Sarabun New" w:cs="TH Sarabun New"/>
+          <w:rFonts w:ascii="TH Sarabun New" w:hAnsi="TH Sarabun New"/>
+          <w:b w:val="0"/>
+          <w:i w:val="0"/>
+          <w:sz w:val="28"/>
         </w:rPr>
-        <w:t>[7] Tesseract OCR. (2026). Data files and language support. https://github.com/tesseract-ocr/tessdata</w:t>
+        <w:t>[7] Tesseract OCR.  (2026).  Data files and language support.  https://github.com/tesseract-ocr/tessdata</w:t>
       </w:r>
     </w:p>
     <w:p>
@@ -8611,9 +8632,12 @@
       </w:pPr>
       <w:r>
         <w:rPr>
-          <w:rFonts w:ascii="TH Sarabun New" w:hAnsi="TH Sarabun New" w:eastAsia="TH Sarabun New" w:cs="TH Sarabun New"/>
+          <w:rFonts w:ascii="TH Sarabun New" w:hAnsi="TH Sarabun New"/>
+          <w:b w:val="0"/>
+          <w:i w:val="0"/>
+          <w:sz w:val="28"/>
         </w:rPr>
-        <w:t>[8] Jaided AI. (2026). EasyOCR. https://github.com/JaidedAI/EasyOCR</w:t>
+        <w:t>[8] Jaided AI.  (2026).  EasyOCR.  https://github.com/JaidedAI/EasyOCR</w:t>
       </w:r>
     </w:p>
     <w:p>
@@ -8624,9 +8648,12 @@
       </w:pPr>
       <w:r>
         <w:rPr>
-          <w:rFonts w:ascii="TH Sarabun New" w:hAnsi="TH Sarabun New" w:eastAsia="TH Sarabun New" w:cs="TH Sarabun New"/>
+          <w:rFonts w:ascii="TH Sarabun New" w:hAnsi="TH Sarabun New"/>
+          <w:b w:val="0"/>
+          <w:i w:val="0"/>
+          <w:sz w:val="28"/>
         </w:rPr>
-        <w:t>[9] Rockchip. (2026). RKNN Toolkit2. https://github.com/airockchip/rknn-toolkit2</w:t>
+        <w:t>[9] Rockchip.  (2026).  RKNN Toolkit2.  https://github.com/airockchip/rknn-toolkit2</w:t>
       </w:r>
     </w:p>
     <w:p>
@@ -8637,9 +8664,12 @@
       </w:pPr>
       <w:r>
         <w:rPr>
-          <w:rFonts w:ascii="TH Sarabun New" w:hAnsi="TH Sarabun New" w:eastAsia="TH Sarabun New" w:cs="TH Sarabun New"/>
+          <w:rFonts w:ascii="TH Sarabun New" w:hAnsi="TH Sarabun New"/>
+          <w:b w:val="0"/>
+          <w:i w:val="0"/>
+          <w:sz w:val="28"/>
         </w:rPr>
-        <w:t>[10] Rockchip. (2026). RKLLM. https://github.com/airockchip/rknn-llm</w:t>
+        <w:t>[10] Rockchip.  (2026).  RKLLM.  https://github.com/airockchip/rknn-llm</w:t>
       </w:r>
     </w:p>
     <w:p>
@@ -8650,9 +8680,12 @@
       </w:pPr>
       <w:r>
         <w:rPr>
-          <w:rFonts w:ascii="TH Sarabun New" w:hAnsi="TH Sarabun New" w:eastAsia="TH Sarabun New" w:cs="TH Sarabun New"/>
+          <w:rFonts w:ascii="TH Sarabun New" w:hAnsi="TH Sarabun New"/>
+          <w:b w:val="0"/>
+          <w:i w:val="0"/>
+          <w:sz w:val="28"/>
         </w:rPr>
-        <w:t>[11] Rockchip. (2022). RK3588 brief datasheet. https://www.rock-chips.com/a/en/products/RK35_Series/2022/0926/1660.html</w:t>
+        <w:t>[11] Rockchip.  (2022).  RK3588 brief datasheet.  https://www.rock-chips.com/a/en/products/RK35_Series/2022/0926/1660.html</w:t>
       </w:r>
     </w:p>
     <w:p>
@@ -8663,9 +8696,12 @@
       </w:pPr>
       <w:r>
         <w:rPr>
-          <w:rFonts w:ascii="TH Sarabun New" w:hAnsi="TH Sarabun New" w:eastAsia="TH Sarabun New" w:cs="TH Sarabun New"/>
+          <w:rFonts w:ascii="TH Sarabun New" w:hAnsi="TH Sarabun New"/>
+          <w:b w:val="0"/>
+          <w:i w:val="0"/>
+          <w:sz w:val="28"/>
         </w:rPr>
-        <w:t>[12] ณัชพล เพ็งพล และ ธนบดี เริ่มรักสกุล. (2569). การพัฒนาระบบประสาทส่วนกลางอัจฉริยะในที่พักอาศัยเพื่อสกัดและวิเคราะห์ข้อมูลห่วงโซ่อุปทานในครัวเรือนด้วยปัญญาประดิษฐ์ประมวลผลเฉพาะถิ่น. รายงานทบทวนวรรณกรรม 32 หน้า, เอกสารภายในโครงงาน.</w:t>
+        <w:t>[12] ณัชพล เพ็งพล และ ธนบดี เริ่มรักสกุล.  (2569).  การพัฒนาระบบประสาทส่วนกลางอัจฉริยะในที่พักอาศัยเพื่อสกัดและวิเคราะห์ข้อมูลห่วงโซ่อุปทานในครัวเรือนด้วยปัญญาประดิษฐ์ประมวลผลเฉพาะถิ่น.  รายงานทบทวนวรรณกรรม 32 หน้า,  เอกสารภายในโครงงาน.</w:t>
       </w:r>
     </w:p>
     <w:p>
@@ -8676,9 +8712,12 @@
       </w:pPr>
       <w:r>
         <w:rPr>
-          <w:rFonts w:ascii="TH Sarabun New" w:hAnsi="TH Sarabun New" w:eastAsia="TH Sarabun New" w:cs="TH Sarabun New"/>
+          <w:rFonts w:ascii="TH Sarabun New" w:hAnsi="TH Sarabun New"/>
+          <w:b w:val="0"/>
+          <w:i w:val="0"/>
+          <w:sz w:val="28"/>
         </w:rPr>
-        <w:t>[13] Radxa. (2026). ROCK 5B introduction and specifications. https://docs.radxa.com/en/rock5/rock5b/getting-started/introduction</w:t>
+        <w:t>[13] Radxa.  (2026).  ROCK 5B introduction and specifications.  https://docs.radxa.com/en/rock5/rock5b/getting-started/introduction</w:t>
       </w:r>
     </w:p>
     <w:p>
@@ -8689,9 +8728,12 @@
       </w:pPr>
       <w:r>
         <w:rPr>
-          <w:rFonts w:ascii="TH Sarabun New" w:hAnsi="TH Sarabun New" w:eastAsia="TH Sarabun New" w:cs="TH Sarabun New"/>
+          <w:rFonts w:ascii="TH Sarabun New" w:hAnsi="TH Sarabun New"/>
+          <w:b w:val="0"/>
+          <w:i w:val="0"/>
+          <w:sz w:val="28"/>
         </w:rPr>
-        <w:t>[14] Rivkin, D., et al. (2025). AIoT smart home via autonomous LLM agents. IEEE Internet of Things Journal, 12(3), 2458-2472. https://doi.org/10.1109/JIOT.2024.3471904</w:t>
+        <w:t>[14] Rivkin,  D.,  et al.  (2025).  AIoT smart home via autonomous LLM agents.  IEEE Internet of Things Journal,  12(3),  2458-2472.  https://doi.org/10.1109/JIOT.2024.3471904</w:t>
       </w:r>
     </w:p>
     <w:p>
@@ -8702,9 +8744,12 @@
       </w:pPr>
       <w:r>
         <w:rPr>
-          <w:rFonts w:ascii="TH Sarabun New" w:hAnsi="TH Sarabun New" w:eastAsia="TH Sarabun New" w:cs="TH Sarabun New"/>
+          <w:rFonts w:ascii="TH Sarabun New" w:hAnsi="TH Sarabun New"/>
+          <w:b w:val="0"/>
+          <w:i w:val="0"/>
+          <w:sz w:val="28"/>
         </w:rPr>
-        <w:t>[15] Sawalha, S., &amp; Al-Naymat, G. (2025). An adaptive Holt-Winters model for seasonal forecasting of Internet of Things (IoT) data streams. IoT, 6(3), Article 39. https://doi.org/10.3390/iot6030039</w:t>
+        <w:t>[15] Sawalha,  S.,  &amp; Al-Naymat,  G.  (2025).  An adaptive Holt-Winters model for seasonal forecasting of Internet of Things (IoT) data streams.  IoT,  6(3),  Article 39.  https://doi.org/10.3390/iot6030039</w:t>
       </w:r>
     </w:p>
     <w:p>
@@ -8715,9 +8760,12 @@
       </w:pPr>
       <w:r>
         <w:rPr>
-          <w:rFonts w:ascii="TH Sarabun New" w:hAnsi="TH Sarabun New" w:eastAsia="TH Sarabun New" w:cs="TH Sarabun New"/>
+          <w:rFonts w:ascii="TH Sarabun New" w:hAnsi="TH Sarabun New"/>
+          <w:b w:val="0"/>
+          <w:i w:val="0"/>
+          <w:sz w:val="28"/>
         </w:rPr>
-        <w:t>[16] Serepas, F., et al. (2025). Lightweight embedded IoT gateway for smart homes based on an ESP32 microcontroller. Computers, 14(9), Article 391. https://doi.org/10.3390/computers14090391</w:t>
+        <w:t>[16] Serepas,  F.,  et al.  (2025).  Lightweight embedded IoT gateway for smart homes based on an ESP32 microcontroller.  Computers,  14(9),  Article 391.  https://doi.org/10.3390/computers14090391</w:t>
       </w:r>
     </w:p>
     <w:p>
@@ -8728,9 +8776,12 @@
       </w:pPr>
       <w:r>
         <w:rPr>
-          <w:rFonts w:ascii="TH Sarabun New" w:hAnsi="TH Sarabun New" w:eastAsia="TH Sarabun New" w:cs="TH Sarabun New"/>
+          <w:rFonts w:ascii="TH Sarabun New" w:hAnsi="TH Sarabun New"/>
+          <w:b w:val="0"/>
+          <w:i w:val="0"/>
+          <w:sz w:val="28"/>
         </w:rPr>
-        <w:t>[17] Yin, W., et al. (2026). ShadowNPU: System and algorithm co-design for NPU-centric on-device LLM inference. Proceedings of MobiSys 2026, 294-308. https://doi.org/10.1145/3745756.3809205</w:t>
+        <w:t>[17] Yin,  W.,  et al.  (2026).  ShadowNPU:  System and algorithm co-design for NPU-centric on-device LLM inference.  Proceedings of MobiSys 2026,  294-308.  https://doi.org/10.1145/3745756.3809205</w:t>
       </w:r>
     </w:p>
     <w:p>
@@ -8741,9 +8792,12 @@
       </w:pPr>
       <w:r>
         <w:rPr>
-          <w:rFonts w:ascii="TH Sarabun New" w:hAnsi="TH Sarabun New" w:eastAsia="TH Sarabun New" w:cs="TH Sarabun New"/>
+          <w:rFonts w:ascii="TH Sarabun New" w:hAnsi="TH Sarabun New"/>
+          <w:b w:val="0"/>
+          <w:i w:val="0"/>
+          <w:sz w:val="28"/>
         </w:rPr>
-        <w:t>[18] Cai, F., Yuan, D., Yang, Z., &amp; Cui, L. (2024). Edge-LLM: A collaborative framework for large language model serving in edge computing. In 2024 IEEE International Conference on Web Services (ICWS) (pp. 799–809). https://doi.org/10.1109/ICWS62655.2024.00099</w:t>
+        <w:t>[18] Cai,  F.,  Yuan,  D.,  Yang,  Z.,  &amp; Cui,  L.  (2024).  Edge-LLM:  A collaborative framework for large language model serving in edge computing.  In 2024 IEEE International Conference on Web Services (ICWS) (pp.  799–809).  https://doi.org/10.1109/ICWS62655.2024.00099</w:t>
       </w:r>
     </w:p>
     <w:p>
@@ -8754,9 +8808,12 @@
       </w:pPr>
       <w:r>
         <w:rPr>
-          <w:rFonts w:ascii="TH Sarabun New" w:hAnsi="TH Sarabun New" w:eastAsia="TH Sarabun New" w:cs="TH Sarabun New"/>
+          <w:rFonts w:ascii="TH Sarabun New" w:hAnsi="TH Sarabun New"/>
+          <w:b w:val="0"/>
+          <w:i w:val="0"/>
+          <w:sz w:val="28"/>
         </w:rPr>
-        <w:t>[19] Moon, S., Cha, J., Park, H., &amp; Kim, J.-Y. (2025). Hybe: GPU-NPU hybrid system for efficient LLM inference with million-token context window. In Proceedings of the 52nd Annual International Symposium on Computer Architecture (pp. 808–820). https://doi.org/10.1145/3695053.3731051</w:t>
+        <w:t>[19] Moon,  S.,  Cha,  J.,  Park,  H.,  &amp; Kim,  J.-Y.  (2025).  Hybe:  GPU-NPU hybrid system for efficient LLM inference with million-token context window.  In Proceedings of the 52nd Annual International Symposium on Computer Architecture (pp.  808–820).  https://doi.org/10.1145/3695053.3731051</w:t>
       </w:r>
     </w:p>
     <w:p>
@@ -8767,9 +8824,12 @@
       </w:pPr>
       <w:r>
         <w:rPr>
-          <w:rFonts w:ascii="TH Sarabun New" w:hAnsi="TH Sarabun New" w:eastAsia="TH Sarabun New" w:cs="TH Sarabun New"/>
+          <w:rFonts w:ascii="TH Sarabun New" w:hAnsi="TH Sarabun New"/>
+          <w:b w:val="0"/>
+          <w:i w:val="0"/>
+          <w:sz w:val="28"/>
         </w:rPr>
-        <w:t>[20] Oloko-Oba, M., Esenogho, E., &amp; Aruleba, K. (2026). From biosignals to bedside: A review of real-time edge machine learning for wearable health monitoring. Bioengineering, 13(5), 559. https://doi.org/10.3390/bioengineering13050559</w:t>
+        <w:t>[20] Oloko-Oba,  M.,  Esenogho,  E.,  &amp; Aruleba,  K.  (2026).  From biosignals to bedside:  A review of real-time edge machine learning for wearable health monitoring.  Bioengineering,  13(5),  559.  https://doi.org/10.3390/bioengineering13050559</w:t>
       </w:r>
     </w:p>
     <w:p>
@@ -8780,9 +8840,12 @@
       </w:pPr>
       <w:r>
         <w:rPr>
-          <w:rFonts w:ascii="TH Sarabun New" w:hAnsi="TH Sarabun New" w:eastAsia="TH Sarabun New" w:cs="TH Sarabun New"/>
+          <w:rFonts w:ascii="TH Sarabun New" w:hAnsi="TH Sarabun New"/>
+          <w:b w:val="0"/>
+          <w:i w:val="0"/>
+          <w:sz w:val="28"/>
         </w:rPr>
-        <w:t>[21] Zheng, Y., Chen, Y., Qian, B., Shi, X., Shu, Y., &amp; Chen, J. (2025). A review on edge large language models: Design, execution, and applications. ACM Computing Surveys, 57(8), Article 209. https://doi.org/10.1145/3719664</w:t>
+        <w:t>[21] Zheng,  Y.,  Chen,  Y.,  Qian,  B.,  Shi,  X.,  Shu,  Y.,  &amp; Chen,  J.  (2025).  A review on edge large language models:  Design,  execution,  and applications.  ACM Computing Surveys,  57(8),  Article 209.  https://doi.org/10.1145/3719664</w:t>
       </w:r>
     </w:p>
     <w:p>
@@ -8793,9 +8856,12 @@
       </w:pPr>
       <w:r>
         <w:rPr>
-          <w:rFonts w:ascii="TH Sarabun New" w:hAnsi="TH Sarabun New" w:eastAsia="TH Sarabun New" w:cs="TH Sarabun New"/>
+          <w:rFonts w:ascii="TH Sarabun New" w:hAnsi="TH Sarabun New"/>
+          <w:b w:val="0"/>
+          <w:i w:val="0"/>
+          <w:sz w:val="28"/>
         </w:rPr>
-        <w:t>[22] Hu, A., Xu, H., Zhang, L., Ye, J., Yan, M., Zhang, J., Jin, Q., Huang, F., &amp; Zhou, J. (2025). mPLUG-DocOwl2: High-resolution compressing for OCR-free multi-page document understanding. In Proceedings of the 63rd Annual Meeting of the Association for Computational Linguistics (Volume 1: Long Papers) (pp. 5817–5834). https://doi.org/10.18653/v1/2025.acl-long.291</w:t>
+        <w:t>[22] Hu,  A.,  Xu,  H.,  Zhang,  L.,  Ye,  J.,  Yan,  M.,  Zhang,  J.,  Jin,  Q.,  Huang,  F.,  &amp; Zhou,  J.  (2025).  mPLUG-DocOwl2:  High-resolution compressing for OCR-free multi-page document understanding.  In Proceedings of the 63rd Annual Meeting of the Association for Computational Linguistics (Volume 1:  Long Papers) (pp.  5817–5834).  https://doi.org/10.18653/v1/2025.acl-long.291</w:t>
       </w:r>
     </w:p>
     <w:p>
@@ -8804,7 +8870,13 @@
         <w:ind w:left="360" w:hanging="360"/>
       </w:pPr>
       <w:r>
-        <w:t>[23] ณัชพล เพ็งพล และ ธนบดี เริ่มรักสกุล. (2569). ผลทดลองก่อนมีบอร์ด: ข้อความอ้างอิงหนึ่งรอบ OCR Local LLM และการเชื่อม MQTT/Home Assistant. ชุดหลักฐานพร้อมค่าแฮชและข้อจำกัด. https://github.com/natchapolp-glitch/Capstone-Project/tree/pc-preboard-implementation/reports/preboard</w:t>
+        <w:rPr>
+          <w:rFonts w:ascii="TH Sarabun New" w:hAnsi="TH Sarabun New"/>
+          <w:b w:val="0"/>
+          <w:i w:val="0"/>
+          <w:sz w:val="28"/>
+        </w:rPr>
+        <w:t>[23] ณัชพล เพ็งพล และ ธนบดี เริ่มรักสกุล.  (2569).  ผลทดลองก่อนมีบอร์ด:  ข้อความอ้างอิงหนึ่งรอบ OCR Local LLM และการเชื่อม MQTT/Home Assistant.  ชุดหลักฐานพร้อมค่าแฮชและข้อจำกัด.  https://github.com/natchapolp-glitch/Capstone-Project/tree/pc-preboard-implementation/reports/preboard</w:t>
       </w:r>
     </w:p>
     <w:p>

</xml_diff>